<commit_message>
Fix Render Docker build and record Xero setup
</commit_message>
<xml_diff>
--- a/Olivander_PRD.docx
+++ b/Olivander_PRD.docx
@@ -8402,6 +8402,11 @@
       </w:r>
     </w:p>
     <w:p>
+      <w:r>
+        <w:t>Owner requirement added 2026-05-03: Olivander must include a Microsoft Outlook/Microsoft 365 connection as a first-class email and calendar provider. A meaningful share of target companies use Outlook instead of Gmail, so Outlook support is required for market coverage, not a nice-to-have integration.</w:t>
+      </w:r>
+    </w:p>
+    <w:p>
       <w:pPr>
         <w:pStyle w:val="Heading2"/>
         <w:spacing w:after="100" w:before="280"/>
@@ -8472,7 +8477,7 @@
           <w:sz w:val="20"/>
           <w:szCs w:val="20"/>
         </w:rPr>
-        <w:t xml:space="preserve">Not a full ERP replacement — it sits on top of Xero and Gmail, not instead of them</w:t>
+        <w:t>Not a full ERP replacement — it sits on top of Xero and the customer's email/calendar provider (Gmail or Microsoft Outlook), not instead of them</w:t>
       </w:r>
     </w:p>
     <w:p>
@@ -10489,19 +10494,13 @@
             </w:tcMar>
           </w:tcPr>
           <w:p>
-            <w:pPr>
-              <w:spacing w:after="0" w:before="0"/>
-            </w:pPr>
-            <w:r>
-              <w:rPr>
-                <w:rFonts w:ascii="Arial" w:cs="Arial" w:eastAsia="Arial" w:hAnsi="Arial"/>
-                <w:b w:val="false"/>
-                <w:bCs w:val="false"/>
-                <w:color w:val="2C3240"/>
-                <w:sz w:val="17"/>
-                <w:szCs w:val="17"/>
-              </w:rPr>
-              <w:t xml:space="preserve">Gmail API + Google Calendar API</w:t>
+            <w:r>
+              <w:rPr>
+                <w:rFonts w:ascii="Arial" w:hAnsi="Arial"/>
+                <w:b w:val="0"/>
+                <w:sz w:val="17"/>
+              </w:rPr>
+              <w:t>Gmail API + Google Calendar API (MVP); Microsoft Graph Outlook/Calendar required next provider</w:t>
             </w:r>
           </w:p>
         </w:tc>
@@ -10557,19 +10556,13 @@
             </w:tcMar>
           </w:tcPr>
           <w:p>
-            <w:pPr>
-              <w:spacing w:after="0" w:before="0"/>
-            </w:pPr>
-            <w:r>
-              <w:rPr>
-                <w:rFonts w:ascii="Arial" w:cs="Arial" w:eastAsia="Arial" w:hAnsi="Arial"/>
-                <w:b w:val="false"/>
-                <w:bCs w:val="false"/>
-                <w:color w:val="2C3240"/>
-                <w:sz w:val="17"/>
-                <w:szCs w:val="17"/>
-              </w:rPr>
-              <w:t xml:space="preserve">OAuth flow under debug</w:t>
+            <w:r>
+              <w:rPr>
+                <w:rFonts w:ascii="Arial" w:hAnsi="Arial"/>
+                <w:b w:val="0"/>
+                <w:sz w:val="17"/>
+              </w:rPr>
+              <w:t>Google OAuth under debug; Outlook required via provider abstraction</w:t>
             </w:r>
           </w:p>
         </w:tc>
@@ -17438,7 +17431,7 @@
           <w:sz w:val="20"/>
           <w:szCs w:val="20"/>
         </w:rPr>
-        <w:t xml:space="preserve">Gmail push notification fires via Cloud Pub/Sub → FastAPI webhook → job added to BullMQ queue with priority based on classification hint</w:t>
+        <w:t>Provider notification fires: Gmail via Cloud Pub/Sub, Outlook via Microsoft Graph change notifications → FastAPI webhook → job added to queue with priority based on classification hint</w:t>
       </w:r>
     </w:p>
     <w:p>
@@ -17457,7 +17450,7 @@
           <w:sz w:val="20"/>
           <w:szCs w:val="20"/>
         </w:rPr>
-        <w:t xml:space="preserve">Email Worker fetches full thread (not just latest message) from Gmail API — thread context required for coherent reply generation</w:t>
+        <w:t>Email Worker fetches full thread (not just latest message) from the active provider API — Gmail API or Microsoft Graph for Outlook. Thread context is required for coherent reply generation.</w:t>
       </w:r>
     </w:p>
     <w:p>
@@ -17590,7 +17583,7 @@
           <w:sz w:val="20"/>
           <w:szCs w:val="20"/>
         </w:rPr>
-        <w:t xml:space="preserve">On approval: email sent via Gmail API, action logged as complete, follow-up sequence triggered if applicable.</w:t>
+        <w:t>On approval: email sent through the active EmailProvider (Gmail API or Outlook/Microsoft Graph), action logged as complete, follow-up sequence triggered if applicable.</w:t>
       </w:r>
     </w:p>
     <w:p>
@@ -35068,7 +35061,7 @@
           <w:sz w:val="20"/>
           <w:szCs w:val="20"/>
         </w:rPr>
-        <w:t xml:space="preserve">Microsoft Outlook + Office 365 integration (unlocks trades businesses running Microsoft 365)</w:t>
+        <w:t>Microsoft Outlook/Microsoft 365 connection via Microsoft Graph (required because many target companies use Outlook instead of Gmail)</w:t>
       </w:r>
     </w:p>
     <w:p>
@@ -39437,7 +39430,7 @@
           <w:sz w:val="20"/>
           <w:szCs w:val="20"/>
         </w:rPr>
-        <w:t xml:space="preserve">The provider abstraction layer for AI models must be built before any model-specific code.</w:t>
+        <w:t>The provider abstraction layer for AI models must be built before any model-specific code. Email and calendar workflows also require provider interfaces so Gmail and Microsoft Outlook can share the same approval-first worker logic.</w:t>
       </w:r>
     </w:p>
     <w:p>

</xml_diff>